<commit_message>
Update Readme and Docu
</commit_message>
<xml_diff>
--- a/classes/StripImageMetadata-PHP-technische-Dokumentation.docx
+++ b/classes/StripImageMetadata-PHP-technische-Dokumentation.docx
@@ -2555,7 +2555,7 @@
                 <w:sz w:val="19"/>
                 <w:lang w:val="de-DE"/>
               </w:rPr>
-              <w:t>POST-Endpunkt /wp-</w:t>
+              <w:t>POST-Endpunkt /</w:t>
             </w:r>
             <w:proofErr w:type="spellStart"/>
             <w:r>
@@ -2563,6 +2563,22 @@
                 <w:sz w:val="19"/>
                 <w:lang w:val="de-DE"/>
               </w:rPr>
+              <w:t>wp</w:t>
+            </w:r>
+            <w:proofErr w:type="spellEnd"/>
+            <w:r>
+              <w:rPr>
+                <w:sz w:val="19"/>
+                <w:lang w:val="de-DE"/>
+              </w:rPr>
+              <w:t>-</w:t>
+            </w:r>
+            <w:proofErr w:type="spellStart"/>
+            <w:r>
+              <w:rPr>
+                <w:sz w:val="19"/>
+                <w:lang w:val="de-DE"/>
+              </w:rPr>
               <w:t>strip</w:t>
             </w:r>
             <w:proofErr w:type="spellEnd"/>
@@ -2571,7 +2587,39 @@
                 <w:sz w:val="19"/>
                 <w:lang w:val="de-DE"/>
               </w:rPr>
-              <w:t>-image-metadata/v1/strip registrieren</w:t>
+              <w:t>-image-</w:t>
+            </w:r>
+            <w:proofErr w:type="spellStart"/>
+            <w:r>
+              <w:rPr>
+                <w:sz w:val="19"/>
+                <w:lang w:val="de-DE"/>
+              </w:rPr>
+              <w:t>metadata</w:t>
+            </w:r>
+            <w:proofErr w:type="spellEnd"/>
+            <w:r>
+              <w:rPr>
+                <w:sz w:val="19"/>
+                <w:lang w:val="de-DE"/>
+              </w:rPr>
+              <w:t>/v1/</w:t>
+            </w:r>
+            <w:proofErr w:type="spellStart"/>
+            <w:r>
+              <w:rPr>
+                <w:sz w:val="19"/>
+                <w:lang w:val="de-DE"/>
+              </w:rPr>
+              <w:t>strip</w:t>
+            </w:r>
+            <w:proofErr w:type="spellEnd"/>
+            <w:r>
+              <w:rPr>
+                <w:sz w:val="19"/>
+                <w:lang w:val="de-DE"/>
+              </w:rPr>
+              <w:t xml:space="preserve"> registrieren</w:t>
             </w:r>
           </w:p>
         </w:tc>
@@ -3060,13 +3108,40 @@
           <w:lang w:val="de-DE"/>
         </w:rPr>
         <w:tab/>
-        <w:t>rest_url( 'wp-</w:t>
       </w:r>
       <w:proofErr w:type="spellStart"/>
       <w:r>
         <w:rPr>
           <w:lang w:val="de-DE"/>
         </w:rPr>
+        <w:t>rest_url</w:t>
+      </w:r>
+      <w:proofErr w:type="spellEnd"/>
+      <w:r>
+        <w:rPr>
+          <w:lang w:val="de-DE"/>
+        </w:rPr>
+        <w:t>( '</w:t>
+      </w:r>
+      <w:proofErr w:type="spellStart"/>
+      <w:r>
+        <w:rPr>
+          <w:lang w:val="de-DE"/>
+        </w:rPr>
+        <w:t>wp</w:t>
+      </w:r>
+      <w:proofErr w:type="spellEnd"/>
+      <w:r>
+        <w:rPr>
+          <w:lang w:val="de-DE"/>
+        </w:rPr>
+        <w:t>-</w:t>
+      </w:r>
+      <w:proofErr w:type="spellStart"/>
+      <w:r>
+        <w:rPr>
+          <w:lang w:val="de-DE"/>
+        </w:rPr>
         <w:t>strip</w:t>
       </w:r>
       <w:proofErr w:type="spellEnd"/>
@@ -3074,7 +3149,35 @@
         <w:rPr>
           <w:lang w:val="de-DE"/>
         </w:rPr>
-        <w:t>-image-metadata/v1/strip' )</w:t>
+        <w:t>-image-</w:t>
+      </w:r>
+      <w:proofErr w:type="spellStart"/>
+      <w:r>
+        <w:rPr>
+          <w:lang w:val="de-DE"/>
+        </w:rPr>
+        <w:t>metadata</w:t>
+      </w:r>
+      <w:proofErr w:type="spellEnd"/>
+      <w:r>
+        <w:rPr>
+          <w:lang w:val="de-DE"/>
+        </w:rPr>
+        <w:t>/v1/</w:t>
+      </w:r>
+      <w:proofErr w:type="spellStart"/>
+      <w:r>
+        <w:rPr>
+          <w:lang w:val="de-DE"/>
+        </w:rPr>
+        <w:t>strip</w:t>
+      </w:r>
+      <w:proofErr w:type="spellEnd"/>
+      <w:r>
+        <w:rPr>
+          <w:lang w:val="de-DE"/>
+        </w:rPr>
+        <w:t>' )</w:t>
       </w:r>
       <w:r>
         <w:rPr>
@@ -3112,7 +3215,21 @@
           <w:lang w:val="de-DE"/>
         </w:rPr>
         <w:tab/>
-        <w:t>'nonce' =&gt; wp_create_nonce( 'wp_rest' ),</w:t>
+        <w:t>'</w:t>
+      </w:r>
+      <w:proofErr w:type="spellStart"/>
+      <w:r>
+        <w:rPr>
+          <w:lang w:val="de-DE"/>
+        </w:rPr>
+        <w:t>nonce</w:t>
+      </w:r>
+      <w:proofErr w:type="spellEnd"/>
+      <w:r>
+        <w:rPr>
+          <w:lang w:val="de-DE"/>
+        </w:rPr>
+        <w:t>' =&gt; wp_create_nonce( 'wp_rest' ),</w:t>
       </w:r>
       <w:r>
         <w:rPr>
@@ -3463,11 +3580,19 @@
           <w:lang w:val="de-DE"/>
         </w:rPr>
       </w:pPr>
-      <w:r>
-        <w:rPr>
-          <w:lang w:val="de-DE"/>
-        </w:rPr>
-        <w:t>register_rest_route(</w:t>
+      <w:proofErr w:type="spellStart"/>
+      <w:r>
+        <w:rPr>
+          <w:lang w:val="de-DE"/>
+        </w:rPr>
+        <w:t>register_rest_route</w:t>
+      </w:r>
+      <w:proofErr w:type="spellEnd"/>
+      <w:r>
+        <w:rPr>
+          <w:lang w:val="de-DE"/>
+        </w:rPr>
+        <w:t>(</w:t>
       </w:r>
       <w:r>
         <w:rPr>
@@ -3480,13 +3605,27 @@
           <w:lang w:val="de-DE"/>
         </w:rPr>
         <w:tab/>
-        <w:t>'wp-</w:t>
+        <w:t>'</w:t>
       </w:r>
       <w:proofErr w:type="spellStart"/>
       <w:r>
         <w:rPr>
           <w:lang w:val="de-DE"/>
         </w:rPr>
+        <w:t>wp</w:t>
+      </w:r>
+      <w:proofErr w:type="spellEnd"/>
+      <w:r>
+        <w:rPr>
+          <w:lang w:val="de-DE"/>
+        </w:rPr>
+        <w:t>-</w:t>
+      </w:r>
+      <w:proofErr w:type="spellStart"/>
+      <w:r>
+        <w:rPr>
+          <w:lang w:val="de-DE"/>
+        </w:rPr>
         <w:t>strip</w:t>
       </w:r>
       <w:proofErr w:type="spellEnd"/>
@@ -3494,7 +3633,21 @@
         <w:rPr>
           <w:lang w:val="de-DE"/>
         </w:rPr>
-        <w:t>-image-metadata/v1',</w:t>
+        <w:t>-image-</w:t>
+      </w:r>
+      <w:proofErr w:type="spellStart"/>
+      <w:r>
+        <w:rPr>
+          <w:lang w:val="de-DE"/>
+        </w:rPr>
+        <w:t>metadata</w:t>
+      </w:r>
+      <w:proofErr w:type="spellEnd"/>
+      <w:r>
+        <w:rPr>
+          <w:lang w:val="de-DE"/>
+        </w:rPr>
+        <w:t>/v1',</w:t>
       </w:r>
       <w:r>
         <w:rPr>
@@ -3507,7 +3660,21 @@
           <w:lang w:val="de-DE"/>
         </w:rPr>
         <w:tab/>
-        <w:t>'/strip',</w:t>
+        <w:t>'/</w:t>
+      </w:r>
+      <w:proofErr w:type="spellStart"/>
+      <w:r>
+        <w:rPr>
+          <w:lang w:val="de-DE"/>
+        </w:rPr>
+        <w:t>strip</w:t>
+      </w:r>
+      <w:proofErr w:type="spellEnd"/>
+      <w:r>
+        <w:rPr>
+          <w:lang w:val="de-DE"/>
+        </w:rPr>
+        <w:t>',</w:t>
       </w:r>
       <w:r>
         <w:rPr>
@@ -3539,7 +3706,21 @@
           <w:lang w:val="de-DE"/>
         </w:rPr>
         <w:tab/>
-        <w:t>'methods' =&gt; \WP_REST_Server::CREATABLE,</w:t>
+        <w:t>'</w:t>
+      </w:r>
+      <w:proofErr w:type="spellStart"/>
+      <w:r>
+        <w:rPr>
+          <w:lang w:val="de-DE"/>
+        </w:rPr>
+        <w:t>methods</w:t>
+      </w:r>
+      <w:proofErr w:type="spellEnd"/>
+      <w:r>
+        <w:rPr>
+          <w:lang w:val="de-DE"/>
+        </w:rPr>
+        <w:t>' =&gt; \WP_REST_Server::CREATABLE,</w:t>
       </w:r>
       <w:r>
         <w:rPr>
@@ -4843,11 +5024,19 @@
           <w:lang w:val="de-DE"/>
         </w:rPr>
       </w:pPr>
-      <w:r>
-        <w:rPr>
-          <w:lang w:val="de-DE"/>
-        </w:rPr>
-        <w:t>metadata[</w:t>
+      <w:proofErr w:type="spellStart"/>
+      <w:r>
+        <w:rPr>
+          <w:lang w:val="de-DE"/>
+        </w:rPr>
+        <w:t>metadata</w:t>
+      </w:r>
+      <w:proofErr w:type="spellEnd"/>
+      <w:r>
+        <w:rPr>
+          <w:lang w:val="de-DE"/>
+        </w:rPr>
+        <w:t>[</w:t>
       </w:r>
       <w:proofErr w:type="spellStart"/>
       <w:r>
@@ -4871,11 +5060,19 @@
           <w:lang w:val="de-DE"/>
         </w:rPr>
       </w:pPr>
-      <w:r>
-        <w:rPr>
-          <w:lang w:val="de-DE"/>
-        </w:rPr>
-        <w:t>metadata[</w:t>
+      <w:proofErr w:type="spellStart"/>
+      <w:r>
+        <w:rPr>
+          <w:lang w:val="de-DE"/>
+        </w:rPr>
+        <w:t>metadata</w:t>
+      </w:r>
+      <w:proofErr w:type="spellEnd"/>
+      <w:r>
+        <w:rPr>
+          <w:lang w:val="de-DE"/>
+        </w:rPr>
+        <w:t>[</w:t>
       </w:r>
       <w:proofErr w:type="spellStart"/>
       <w:r>
@@ -4899,11 +5096,19 @@
           <w:lang w:val="de-DE"/>
         </w:rPr>
       </w:pPr>
-      <w:r>
-        <w:rPr>
-          <w:lang w:val="de-DE"/>
-        </w:rPr>
-        <w:t>metadata[</w:t>
+      <w:proofErr w:type="spellStart"/>
+      <w:r>
+        <w:rPr>
+          <w:lang w:val="de-DE"/>
+        </w:rPr>
+        <w:t>metadata</w:t>
+      </w:r>
+      <w:proofErr w:type="spellEnd"/>
+      <w:r>
+        <w:rPr>
+          <w:lang w:val="de-DE"/>
+        </w:rPr>
+        <w:t>[</w:t>
       </w:r>
       <w:proofErr w:type="spellStart"/>
       <w:r>
@@ -4989,13 +5194,27 @@
         <w:rPr>
           <w:lang w:val="de-DE"/>
         </w:rPr>
-        <w:t>$paths[] = $</w:t>
+        <w:t>$</w:t>
       </w:r>
       <w:proofErr w:type="spellStart"/>
       <w:r>
         <w:rPr>
           <w:lang w:val="de-DE"/>
         </w:rPr>
+        <w:t>paths</w:t>
+      </w:r>
+      <w:proofErr w:type="spellEnd"/>
+      <w:r>
+        <w:rPr>
+          <w:lang w:val="de-DE"/>
+        </w:rPr>
+        <w:t>[] = $</w:t>
+      </w:r>
+      <w:proofErr w:type="spellStart"/>
+      <w:r>
+        <w:rPr>
+          <w:lang w:val="de-DE"/>
+        </w:rPr>
         <w:t>attachment_path</w:t>
       </w:r>
       <w:proofErr w:type="spellEnd"/>
@@ -5010,13 +5229,27 @@
           <w:lang w:val="de-DE"/>
         </w:rPr>
         <w:br/>
-        <w:t xml:space="preserve">$paths[] = $dir . '/' . </w:t>
+        <w:t>$</w:t>
       </w:r>
       <w:proofErr w:type="spellStart"/>
       <w:r>
         <w:rPr>
           <w:lang w:val="de-DE"/>
         </w:rPr>
+        <w:t>paths</w:t>
+      </w:r>
+      <w:proofErr w:type="spellEnd"/>
+      <w:r>
+        <w:rPr>
+          <w:lang w:val="de-DE"/>
+        </w:rPr>
+        <w:t xml:space="preserve">[] = $dir . '/' . </w:t>
+      </w:r>
+      <w:proofErr w:type="spellStart"/>
+      <w:r>
+        <w:rPr>
+          <w:lang w:val="de-DE"/>
+        </w:rPr>
         <w:t>basename</w:t>
       </w:r>
       <w:proofErr w:type="spellEnd"/>
@@ -5059,13 +5292,27 @@
           <w:lang w:val="de-DE"/>
         </w:rPr>
         <w:br/>
-        <w:t>$paths[] = $dir . '/' . $</w:t>
+        <w:t>$</w:t>
       </w:r>
       <w:proofErr w:type="spellStart"/>
       <w:r>
         <w:rPr>
           <w:lang w:val="de-DE"/>
         </w:rPr>
+        <w:t>paths</w:t>
+      </w:r>
+      <w:proofErr w:type="spellEnd"/>
+      <w:r>
+        <w:rPr>
+          <w:lang w:val="de-DE"/>
+        </w:rPr>
+        <w:t>[] = $dir . '/' . $</w:t>
+      </w:r>
+      <w:proofErr w:type="spellStart"/>
+      <w:r>
+        <w:rPr>
+          <w:lang w:val="de-DE"/>
+        </w:rPr>
         <w:t>attachment_meta</w:t>
       </w:r>
       <w:proofErr w:type="spellEnd"/>
@@ -5094,13 +5341,27 @@
           <w:lang w:val="de-DE"/>
         </w:rPr>
         <w:br/>
-        <w:t>$paths[] = $dir . '/' . $</w:t>
+        <w:t>$</w:t>
       </w:r>
       <w:proofErr w:type="spellStart"/>
       <w:r>
         <w:rPr>
           <w:lang w:val="de-DE"/>
         </w:rPr>
+        <w:t>paths</w:t>
+      </w:r>
+      <w:proofErr w:type="spellEnd"/>
+      <w:r>
+        <w:rPr>
+          <w:lang w:val="de-DE"/>
+        </w:rPr>
+        <w:t>[] = $dir . '/' . $</w:t>
+      </w:r>
+      <w:proofErr w:type="spellStart"/>
+      <w:r>
+        <w:rPr>
+          <w:lang w:val="de-DE"/>
+        </w:rPr>
         <w:t>size</w:t>
       </w:r>
       <w:proofErr w:type="spellEnd"/>
@@ -5135,13 +5396,26 @@
           <w:lang w:val="de-DE"/>
         </w:rPr>
         <w:br/>
-        <w:t xml:space="preserve">return </w:t>
       </w:r>
       <w:proofErr w:type="spellStart"/>
       <w:r>
         <w:rPr>
           <w:lang w:val="de-DE"/>
         </w:rPr>
+        <w:t>return</w:t>
+      </w:r>
+      <w:proofErr w:type="spellEnd"/>
+      <w:r>
+        <w:rPr>
+          <w:lang w:val="de-DE"/>
+        </w:rPr>
+        <w:t xml:space="preserve"> </w:t>
+      </w:r>
+      <w:proofErr w:type="spellStart"/>
+      <w:r>
+        <w:rPr>
+          <w:lang w:val="de-DE"/>
+        </w:rPr>
         <w:t>array_unique</w:t>
       </w:r>
       <w:proofErr w:type="spellEnd"/>
@@ -5149,7 +5423,21 @@
         <w:rPr>
           <w:lang w:val="de-DE"/>
         </w:rPr>
-        <w:t>( $paths );</w:t>
+        <w:t>( $</w:t>
+      </w:r>
+      <w:proofErr w:type="spellStart"/>
+      <w:r>
+        <w:rPr>
+          <w:lang w:val="de-DE"/>
+        </w:rPr>
+        <w:t>paths</w:t>
+      </w:r>
+      <w:proofErr w:type="spellEnd"/>
+      <w:r>
+        <w:rPr>
+          <w:lang w:val="de-DE"/>
+        </w:rPr>
+        <w:t xml:space="preserve"> );</w:t>
       </w:r>
     </w:p>
     <w:p>
@@ -5445,6 +5733,12 @@
         </w:rPr>
         <w:t>Gesicherte Daten wieder setzen.</w:t>
       </w:r>
+      <w:r>
+        <w:rPr>
+          <w:lang w:val="de-DE"/>
+        </w:rPr>
+        <w:t xml:space="preserve"> Nur ICC-Profil. Bei Orientation-Tag Bild rotieren.</w:t>
+      </w:r>
     </w:p>
     <w:p>
       <w:pPr>
@@ -5463,6 +5757,12 @@
         </w:rPr>
         <w:t>Entweder ein Copyright-Template verwenden oder das bearbeitete Bild direkt schreiben.</w:t>
       </w:r>
+      <w:r>
+        <w:rPr>
+          <w:lang w:val="de-DE"/>
+        </w:rPr>
+        <w:t xml:space="preserve"> ICC setzen.</w:t>
+      </w:r>
     </w:p>
     <w:p>
       <w:pPr>
@@ -5548,7 +5848,21 @@
         <w:rPr>
           <w:lang w:val="de-DE"/>
         </w:rPr>
-        <w:t xml:space="preserve">. has_supported_image_library() ergänzt </w:t>
+        <w:t xml:space="preserve">. </w:t>
+      </w:r>
+      <w:proofErr w:type="spellStart"/>
+      <w:r>
+        <w:rPr>
+          <w:lang w:val="de-DE"/>
+        </w:rPr>
+        <w:t>has_supported_image_library</w:t>
+      </w:r>
+      <w:proofErr w:type="spellEnd"/>
+      <w:r>
+        <w:rPr>
+          <w:lang w:val="de-DE"/>
+        </w:rPr>
+        <w:t xml:space="preserve">() ergänzt </w:t>
       </w:r>
       <w:proofErr w:type="spellStart"/>
       <w:r>
@@ -5789,12 +6103,37 @@
                 <w:lang w:val="de-DE"/>
               </w:rPr>
             </w:pPr>
-            <w:r>
-              <w:rPr>
-                <w:sz w:val="19"/>
-                <w:lang w:val="de-DE"/>
-              </w:rPr>
-              <w:t>new Imagick($</w:t>
+            <w:proofErr w:type="spellStart"/>
+            <w:r>
+              <w:rPr>
+                <w:sz w:val="19"/>
+                <w:lang w:val="de-DE"/>
+              </w:rPr>
+              <w:t>new</w:t>
+            </w:r>
+            <w:proofErr w:type="spellEnd"/>
+            <w:r>
+              <w:rPr>
+                <w:sz w:val="19"/>
+                <w:lang w:val="de-DE"/>
+              </w:rPr>
+              <w:t xml:space="preserve"> </w:t>
+            </w:r>
+            <w:proofErr w:type="spellStart"/>
+            <w:r>
+              <w:rPr>
+                <w:sz w:val="19"/>
+                <w:lang w:val="de-DE"/>
+              </w:rPr>
+              <w:t>Imagick</w:t>
+            </w:r>
+            <w:proofErr w:type="spellEnd"/>
+            <w:r>
+              <w:rPr>
+                <w:sz w:val="19"/>
+                <w:lang w:val="de-DE"/>
+              </w:rPr>
+              <w:t>($</w:t>
             </w:r>
             <w:proofErr w:type="spellStart"/>
             <w:r>
@@ -5832,12 +6171,37 @@
                 <w:lang w:val="de-DE"/>
               </w:rPr>
             </w:pPr>
-            <w:r>
-              <w:rPr>
-                <w:sz w:val="19"/>
-                <w:lang w:val="de-DE"/>
-              </w:rPr>
-              <w:t>new Gmagick($</w:t>
+            <w:proofErr w:type="spellStart"/>
+            <w:r>
+              <w:rPr>
+                <w:sz w:val="19"/>
+                <w:lang w:val="de-DE"/>
+              </w:rPr>
+              <w:t>new</w:t>
+            </w:r>
+            <w:proofErr w:type="spellEnd"/>
+            <w:r>
+              <w:rPr>
+                <w:sz w:val="19"/>
+                <w:lang w:val="de-DE"/>
+              </w:rPr>
+              <w:t xml:space="preserve"> </w:t>
+            </w:r>
+            <w:proofErr w:type="spellStart"/>
+            <w:r>
+              <w:rPr>
+                <w:sz w:val="19"/>
+                <w:lang w:val="de-DE"/>
+              </w:rPr>
+              <w:t>Gmagick</w:t>
+            </w:r>
+            <w:proofErr w:type="spellEnd"/>
+            <w:r>
+              <w:rPr>
+                <w:sz w:val="19"/>
+                <w:lang w:val="de-DE"/>
+              </w:rPr>
+              <w:t>($</w:t>
             </w:r>
             <w:proofErr w:type="spellStart"/>
             <w:r>
@@ -6117,7 +6481,7 @@
                 <w:sz w:val="19"/>
                 <w:lang w:val="de-DE"/>
               </w:rPr>
-              <w:t>get</w:t>
+              <w:t>getImageOrientation</w:t>
             </w:r>
             <w:proofErr w:type="spellEnd"/>
             <w:r>
@@ -6125,17 +6489,8 @@
                 <w:sz w:val="19"/>
                 <w:lang w:val="de-DE"/>
               </w:rPr>
-              <w:t>/</w:t>
-            </w:r>
-            <w:proofErr w:type="spellStart"/>
-            <w:r>
-              <w:rPr>
-                <w:sz w:val="19"/>
-                <w:lang w:val="de-DE"/>
-              </w:rPr>
-              <w:t>setImageOrientation</w:t>
-            </w:r>
-            <w:proofErr w:type="spellEnd"/>
+              <w:t xml:space="preserve"> und Rotation des Bildes</w:t>
+            </w:r>
           </w:p>
         </w:tc>
         <w:tc>
@@ -7782,7 +8137,21 @@
         <w:rPr>
           <w:lang w:val="de-DE"/>
         </w:rPr>
-        <w:t>-Einstellung in rest_log_messages aufgenommen und kann Bestandteil der REST-Antwort werden.</w:t>
+        <w:t xml:space="preserve">-Einstellung in </w:t>
+      </w:r>
+      <w:proofErr w:type="spellStart"/>
+      <w:r>
+        <w:rPr>
+          <w:lang w:val="de-DE"/>
+        </w:rPr>
+        <w:t>rest_log_messages</w:t>
+      </w:r>
+      <w:proofErr w:type="spellEnd"/>
+      <w:r>
+        <w:rPr>
+          <w:lang w:val="de-DE"/>
+        </w:rPr>
+        <w:t xml:space="preserve"> aufgenommen und kann Bestandteil der REST-Antwort werden.</w:t>
       </w:r>
     </w:p>
     <w:p>
@@ -7864,13 +8233,55 @@
         <w:rPr>
           <w:lang w:val="de-DE"/>
         </w:rPr>
-        <w:t>public function logger( string $</w:t>
+        <w:t xml:space="preserve">public </w:t>
       </w:r>
       <w:proofErr w:type="spellStart"/>
       <w:r>
         <w:rPr>
           <w:lang w:val="de-DE"/>
         </w:rPr>
+        <w:t>function</w:t>
+      </w:r>
+      <w:proofErr w:type="spellEnd"/>
+      <w:r>
+        <w:rPr>
+          <w:lang w:val="de-DE"/>
+        </w:rPr>
+        <w:t xml:space="preserve"> </w:t>
+      </w:r>
+      <w:proofErr w:type="spellStart"/>
+      <w:r>
+        <w:rPr>
+          <w:lang w:val="de-DE"/>
+        </w:rPr>
+        <w:t>logger</w:t>
+      </w:r>
+      <w:proofErr w:type="spellEnd"/>
+      <w:r>
+        <w:rPr>
+          <w:lang w:val="de-DE"/>
+        </w:rPr>
+        <w:t xml:space="preserve">( </w:t>
+      </w:r>
+      <w:proofErr w:type="spellStart"/>
+      <w:r>
+        <w:rPr>
+          <w:lang w:val="de-DE"/>
+        </w:rPr>
+        <w:t>string</w:t>
+      </w:r>
+      <w:proofErr w:type="spellEnd"/>
+      <w:r>
+        <w:rPr>
+          <w:lang w:val="de-DE"/>
+        </w:rPr>
+        <w:t xml:space="preserve"> $</w:t>
+      </w:r>
+      <w:proofErr w:type="spellStart"/>
+      <w:r>
+        <w:rPr>
+          <w:lang w:val="de-DE"/>
+        </w:rPr>
         <w:t>msg</w:t>
       </w:r>
       <w:proofErr w:type="spellEnd"/>
@@ -7878,7 +8289,21 @@
         <w:rPr>
           <w:lang w:val="de-DE"/>
         </w:rPr>
-        <w:t xml:space="preserve"> ) :void {</w:t>
+        <w:t xml:space="preserve"> ) :</w:t>
+      </w:r>
+      <w:proofErr w:type="spellStart"/>
+      <w:r>
+        <w:rPr>
+          <w:lang w:val="de-DE"/>
+        </w:rPr>
+        <w:t>void</w:t>
+      </w:r>
+      <w:proofErr w:type="spellEnd"/>
+      <w:r>
+        <w:rPr>
+          <w:lang w:val="de-DE"/>
+        </w:rPr>
+        <w:t xml:space="preserve"> {</w:t>
       </w:r>
       <w:r>
         <w:rPr>
@@ -7891,7 +8316,35 @@
           <w:lang w:val="de-DE"/>
         </w:rPr>
         <w:tab/>
-        <w:t>$this-&gt;rest_log_messages[] = $</w:t>
+        <w:t>$</w:t>
+      </w:r>
+      <w:proofErr w:type="spellStart"/>
+      <w:r>
+        <w:rPr>
+          <w:lang w:val="de-DE"/>
+        </w:rPr>
+        <w:t>this</w:t>
+      </w:r>
+      <w:proofErr w:type="spellEnd"/>
+      <w:r>
+        <w:rPr>
+          <w:lang w:val="de-DE"/>
+        </w:rPr>
+        <w:t>-&gt;</w:t>
+      </w:r>
+      <w:proofErr w:type="spellStart"/>
+      <w:r>
+        <w:rPr>
+          <w:lang w:val="de-DE"/>
+        </w:rPr>
+        <w:t>rest_log_messages</w:t>
+      </w:r>
+      <w:proofErr w:type="spellEnd"/>
+      <w:r>
+        <w:rPr>
+          <w:lang w:val="de-DE"/>
+        </w:rPr>
+        <w:t>[] = $</w:t>
       </w:r>
       <w:proofErr w:type="spellStart"/>
       <w:r>
@@ -8526,13 +8979,27 @@
         <w:rPr>
           <w:lang w:val="de-DE"/>
         </w:rPr>
-        <w:t xml:space="preserve">skalare Parameter- und Rückgabetypen wie string, </w:t>
+        <w:t xml:space="preserve">skalare Parameter- und Rückgabetypen wie </w:t>
       </w:r>
       <w:proofErr w:type="spellStart"/>
       <w:r>
         <w:rPr>
           <w:lang w:val="de-DE"/>
         </w:rPr>
+        <w:t>string</w:t>
+      </w:r>
+      <w:proofErr w:type="spellEnd"/>
+      <w:r>
+        <w:rPr>
+          <w:lang w:val="de-DE"/>
+        </w:rPr>
+        <w:t xml:space="preserve">, </w:t>
+      </w:r>
+      <w:proofErr w:type="spellStart"/>
+      <w:r>
+        <w:rPr>
+          <w:lang w:val="de-DE"/>
+        </w:rPr>
         <w:t>int</w:t>
       </w:r>
       <w:proofErr w:type="spellEnd"/>
@@ -8554,7 +9021,21 @@
         <w:rPr>
           <w:lang w:val="de-DE"/>
         </w:rPr>
-        <w:t>, array und void;</w:t>
+        <w:t xml:space="preserve">, </w:t>
+      </w:r>
+      <w:proofErr w:type="spellStart"/>
+      <w:r>
+        <w:rPr>
+          <w:lang w:val="de-DE"/>
+        </w:rPr>
+        <w:t>array</w:t>
+      </w:r>
+      <w:proofErr w:type="spellEnd"/>
+      <w:r>
+        <w:rPr>
+          <w:lang w:val="de-DE"/>
+        </w:rPr>
+        <w:t xml:space="preserve"> und void;</w:t>
       </w:r>
     </w:p>
     <w:p>
@@ -8624,13 +9105,55 @@
         <w:rPr>
           <w:lang w:val="de-DE"/>
         </w:rPr>
-        <w:t>-Angaben wie array&lt;string&gt;, array&lt;</w:t>
+        <w:t xml:space="preserve">-Angaben wie </w:t>
       </w:r>
       <w:proofErr w:type="spellStart"/>
       <w:r>
         <w:rPr>
           <w:lang w:val="de-DE"/>
         </w:rPr>
+        <w:t>array</w:t>
+      </w:r>
+      <w:proofErr w:type="spellEnd"/>
+      <w:r>
+        <w:rPr>
+          <w:lang w:val="de-DE"/>
+        </w:rPr>
+        <w:t>&lt;</w:t>
+      </w:r>
+      <w:proofErr w:type="spellStart"/>
+      <w:r>
+        <w:rPr>
+          <w:lang w:val="de-DE"/>
+        </w:rPr>
+        <w:t>string</w:t>
+      </w:r>
+      <w:proofErr w:type="spellEnd"/>
+      <w:r>
+        <w:rPr>
+          <w:lang w:val="de-DE"/>
+        </w:rPr>
+        <w:t xml:space="preserve">&gt;, </w:t>
+      </w:r>
+      <w:proofErr w:type="spellStart"/>
+      <w:r>
+        <w:rPr>
+          <w:lang w:val="de-DE"/>
+        </w:rPr>
+        <w:t>array</w:t>
+      </w:r>
+      <w:proofErr w:type="spellEnd"/>
+      <w:r>
+        <w:rPr>
+          <w:lang w:val="de-DE"/>
+        </w:rPr>
+        <w:t>&lt;</w:t>
+      </w:r>
+      <w:proofErr w:type="spellStart"/>
+      <w:r>
+        <w:rPr>
+          <w:lang w:val="de-DE"/>
+        </w:rPr>
         <w:t>int</w:t>
       </w:r>
       <w:proofErr w:type="spellEnd"/>
@@ -8638,7 +9161,35 @@
         <w:rPr>
           <w:lang w:val="de-DE"/>
         </w:rPr>
-        <w:t xml:space="preserve">&gt; und array&lt;string, </w:t>
+        <w:t xml:space="preserve">&gt; und </w:t>
+      </w:r>
+      <w:proofErr w:type="spellStart"/>
+      <w:r>
+        <w:rPr>
+          <w:lang w:val="de-DE"/>
+        </w:rPr>
+        <w:t>array</w:t>
+      </w:r>
+      <w:proofErr w:type="spellEnd"/>
+      <w:r>
+        <w:rPr>
+          <w:lang w:val="de-DE"/>
+        </w:rPr>
+        <w:t>&lt;</w:t>
+      </w:r>
+      <w:proofErr w:type="spellStart"/>
+      <w:r>
+        <w:rPr>
+          <w:lang w:val="de-DE"/>
+        </w:rPr>
+        <w:t>string</w:t>
+      </w:r>
+      <w:proofErr w:type="spellEnd"/>
+      <w:r>
+        <w:rPr>
+          <w:lang w:val="de-DE"/>
+        </w:rPr>
+        <w:t xml:space="preserve">, </w:t>
       </w:r>
       <w:proofErr w:type="spellStart"/>
       <w:r>
@@ -8752,7 +9303,21 @@
         <w:rPr>
           <w:lang w:val="de-DE"/>
         </w:rPr>
-        <w:t xml:space="preserve">lokale Normalisierung dynamischer WordPress-Rückgaben, beispielsweise absint() und der </w:t>
+        <w:t xml:space="preserve">lokale Normalisierung dynamischer WordPress-Rückgaben, beispielsweise </w:t>
+      </w:r>
+      <w:proofErr w:type="spellStart"/>
+      <w:r>
+        <w:rPr>
+          <w:lang w:val="de-DE"/>
+        </w:rPr>
+        <w:t>absint</w:t>
+      </w:r>
+      <w:proofErr w:type="spellEnd"/>
+      <w:r>
+        <w:rPr>
+          <w:lang w:val="de-DE"/>
+        </w:rPr>
+        <w:t xml:space="preserve">() und der </w:t>
       </w:r>
       <w:proofErr w:type="spellStart"/>
       <w:r>
@@ -9744,7 +10309,21 @@
         <w:rPr>
           <w:lang w:val="de-DE"/>
         </w:rPr>
-        <w:t xml:space="preserve">Der Imagick-Zweig verwendet </w:t>
+        <w:t xml:space="preserve">Der </w:t>
+      </w:r>
+      <w:proofErr w:type="spellStart"/>
+      <w:r>
+        <w:rPr>
+          <w:lang w:val="de-DE"/>
+        </w:rPr>
+        <w:t>Imagick</w:t>
+      </w:r>
+      <w:proofErr w:type="spellEnd"/>
+      <w:r>
+        <w:rPr>
+          <w:lang w:val="de-DE"/>
+        </w:rPr>
+        <w:t xml:space="preserve">-Zweig verwendet </w:t>
       </w:r>
       <w:proofErr w:type="spellStart"/>
       <w:r>
@@ -11062,7 +11641,21 @@
         <w:rPr>
           <w:lang w:val="de-DE"/>
         </w:rPr>
-        <w:t xml:space="preserve">Drei offene TODO-Bereiche betreffen Dateigröße, Gmagick-Orientierung und </w:t>
+        <w:t xml:space="preserve">Drei offene TODO-Bereiche betreffen Dateigröße, </w:t>
+      </w:r>
+      <w:proofErr w:type="spellStart"/>
+      <w:r>
+        <w:rPr>
+          <w:lang w:val="de-DE"/>
+        </w:rPr>
+        <w:t>Gmagick</w:t>
+      </w:r>
+      <w:proofErr w:type="spellEnd"/>
+      <w:r>
+        <w:rPr>
+          <w:lang w:val="de-DE"/>
+        </w:rPr>
+        <w:t xml:space="preserve">-Orientierung und </w:t>
       </w:r>
       <w:proofErr w:type="spellStart"/>
       <w:r>
@@ -11239,8 +11832,17 @@
         <w:color w:val="6B7280"/>
         <w:sz w:val="17"/>
       </w:rPr>
-      <w:t xml:space="preserve"> Dokumentation  |  StripImageMetadata.php</w:t>
+      <w:t xml:space="preserve"> Dokumentation  |  </w:t>
     </w:r>
+    <w:proofErr w:type="spellStart"/>
+    <w:r>
+      <w:rPr>
+        <w:color w:val="6B7280"/>
+        <w:sz w:val="17"/>
+      </w:rPr>
+      <w:t>StripImageMetadata.php</w:t>
+    </w:r>
+    <w:proofErr w:type="spellEnd"/>
   </w:p>
 </w:hdr>
 </file>

</xml_diff>